<commit_message>
Ensure form values fit on a single line within document templates
Implement font-fitting logic in `docxCellUtils` to ensure values injected into document templates do not wrap. This involves adjusting font sizes of inserted runs based on available cell width, with specific helpers for empty paragraphs and appending values after existing anchors. Updates are reflected in `confinementRulesFiller.ts` and `dc6221CellInspectionFiller.ts`, along with updated sample documents and documentation in `replit.md`.

Replit-Commit-Author: Agent
Replit-Commit-Session-Id: 12181e52-eb76-427f-8200-e868f0fd7a8f
Replit-Commit-Checkpoint-Type: full_checkpoint
Replit-Commit-Event-Id: a47cbb37-60ea-485f-a984-a4a8fbdec39f
Replit-Commit-Screenshot-Url: https://storage.googleapis.com/screenshot-production-us-central1/d76cc230-a508-46af-99a2-c8a4a09ee388/12181e52-eb76-427f-8200-e868f0fd7a8f/hkiTPMe
Replit-Helium-Checkpoint-Created: true
</commit_message>
<xml_diff>
--- a/exports/Confinement Rules - Sample.docx
+++ b/exports/Confinement Rules - Sample.docx
@@ -2067,6 +2067,11 @@
               <w:jc w:val="center"/>
             </w:pPr>
             <w:r>
+              <w:rPr>
+                <w:rFonts w:ascii="Times New Roman" w:hAnsi="Times New Roman" w:cs="Times New Roman"/>
+                <w:sz w:val="20"/>
+                <w:szCs w:val="20"/>
+              </w:rPr>
               <w:t xml:space="preserve">Doe, John</w:t>
             </w:r>
           </w:p>
@@ -2132,6 +2137,11 @@
               <w:jc w:val="both"/>
             </w:pPr>
             <w:r>
+              <w:rPr>
+                <w:rFonts w:ascii="Times New Roman" w:hAnsi="Times New Roman" w:cs="Times New Roman"/>
+                <w:sz w:val="20"/>
+                <w:szCs w:val="20"/>
+              </w:rPr>
               <w:t xml:space="preserve">X12345</w:t>
             </w:r>
           </w:p>
@@ -2168,6 +2178,11 @@
               <w:jc w:val="both"/>
             </w:pPr>
             <w:r>
+              <w:rPr>
+                <w:rFonts w:ascii="Times New Roman" w:hAnsi="Times New Roman" w:cs="Times New Roman"/>
+                <w:sz w:val="20"/>
+                <w:szCs w:val="20"/>
+              </w:rPr>
               <w:t xml:space="preserve">06/20/26</w:t>
             </w:r>
           </w:p>
@@ -2360,6 +2375,11 @@
               <w:jc w:val="center"/>
             </w:pPr>
             <w:r>
+              <w:rPr>
+                <w:rFonts w:ascii="Times New Roman" w:hAnsi="Times New Roman" w:cs="Times New Roman"/>
+                <w:sz w:val="20"/>
+                <w:szCs w:val="20"/>
+              </w:rPr>
               <w:t xml:space="preserve">R. Smith</w:t>
             </w:r>
           </w:p>
@@ -2431,6 +2451,11 @@
               <w:jc w:val="both"/>
             </w:pPr>
             <w:r>
+              <w:rPr>
+                <w:rFonts w:ascii="Times New Roman" w:hAnsi="Times New Roman" w:cs="Times New Roman"/>
+                <w:sz w:val="20"/>
+                <w:szCs w:val="20"/>
+              </w:rPr>
               <w:t xml:space="preserve">Sgt.</w:t>
             </w:r>
           </w:p>
@@ -2468,6 +2493,11 @@
               <w:jc w:val="both"/>
             </w:pPr>
             <w:r>
+              <w:rPr>
+                <w:rFonts w:ascii="Times New Roman" w:hAnsi="Times New Roman" w:cs="Times New Roman"/>
+                <w:sz w:val="20"/>
+                <w:szCs w:val="20"/>
+              </w:rPr>
               <w:t xml:space="preserve">06/20/26</w:t>
             </w:r>
           </w:p>

</xml_diff>